<commit_message>
Resources Doc Updated * JavaFX confirmed as GUI framework tool
</commit_message>
<xml_diff>
--- a/Documentation/Resources.docx
+++ b/Documentation/Resources.docx
@@ -41,7 +41,27 @@
         <w:rPr>
           <w:rFonts w:ascii="Times New Roman" w:hAnsi="Times New Roman" w:cs="Times New Roman"/>
         </w:rPr>
-        <w:t>(JavaFX, React, Swing) as the framework for GUI implementation.</w:t>
+        <w:t>JavaFX</w:t>
+      </w:r>
+      <w:r>
+        <w:rPr>
+          <w:rFonts w:ascii="Times New Roman" w:hAnsi="Times New Roman" w:cs="Times New Roman"/>
+        </w:rPr>
+        <w:t xml:space="preserve"> </w:t>
+      </w:r>
+      <w:proofErr w:type="gramStart"/>
+      <w:r>
+        <w:rPr>
+          <w:rFonts w:ascii="Times New Roman" w:hAnsi="Times New Roman" w:cs="Times New Roman"/>
+        </w:rPr>
+        <w:t>as</w:t>
+      </w:r>
+      <w:proofErr w:type="gramEnd"/>
+      <w:r>
+        <w:rPr>
+          <w:rFonts w:ascii="Times New Roman" w:hAnsi="Times New Roman" w:cs="Times New Roman"/>
+        </w:rPr>
+        <w:t xml:space="preserve"> the framework for GUI implementation.</w:t>
       </w:r>
     </w:p>
     <w:p>

</xml_diff>